<commit_message>
CL2: complete Foundation-Skills coverage (105/105) — co-evidenced FS + fix 501 FS Writing phantom
Tag the implicitly co-evidenced Foundation Skills into the AT1/AT2 marking benchmarks per the
assessment plan (G1: 501 Planning&organising in AT1 Part B; G11: 501/503/505 Reading,
Self-management, Problem solving co-evidenced through the technical work, not separately assessed).
Drop the spurious 501 FS Writing tag from AT1 B14 (501 has no Writing FS). Cluster-coverage
validator now passes 100%.

Co-Authored-By: Claude Opus 4.8 (1M context) <noreply@anthropic.com>
</commit_message>
<xml_diff>
--- a/S1-CL2-Cloud-Disaster-Recovery/assessments/AT1/AT1-Design-DR-Plan-Assessor.docx
+++ b/S1-CL2-Cloud-Disaster-Recovery/assessments/AT1/AT1-Design-DR-Plan-Assessor.docx
@@ -2603,7 +2603,7 @@
         <w:t xml:space="preserve">B14  —  </w:t>
       </w:r>
       <w:r>
-        <w:t>[ICTCLD501 PC 4.3] document the DR plan according to business needs and requirements; [FS Writing].</w:t>
+        <w:t>[ICTCLD501 PC 4.3] document the DR plan according to business needs and requirements.</w:t>
       </w:r>
     </w:p>
     <w:p>
@@ -2710,6 +2710,42 @@
       </w:r>
       <w:r>
         <w:t>[ICTCLD501 FS Oral communication] listening/questioning and industry language for the audience.</w:t>
+      </w:r>
+    </w:p>
+    <w:p>
+      <w:pPr>
+        <w:pStyle w:val="Heading2"/>
+      </w:pPr>
+      <w:r>
+        <w:t>Foundation Skills (co-evidenced — not separately assessed)</w:t>
+      </w:r>
+    </w:p>
+    <w:p>
+      <w:pPr>
+        <w:pStyle w:val="Assessortext"/>
+      </w:pPr>
+      <w:r>
+        <w:rPr>
+          <w:b/>
+        </w:rPr>
+        <w:t xml:space="preserve">FS1  —  </w:t>
+      </w:r>
+      <w:r>
+        <w:t>[ICTCLD501 FS Reading] · [ICTCLD501 FS Self-management] · [ICTCLD501 FS Problem solving] · [ICTCLD501 FS Planning and organising] — naturally evidenced through the DR requirements, impact analysis and recovery-strategy work and its troubleshooting; the marking guide notes where each is demonstrated rather than assessing it as a separate criterion.</w:t>
+      </w:r>
+    </w:p>
+    <w:p>
+      <w:pPr>
+        <w:pStyle w:val="Assessortext"/>
+      </w:pPr>
+      <w:r>
+        <w:rPr>
+          <w:b/>
+        </w:rPr>
+        <w:t xml:space="preserve">FS2  —  </w:t>
+      </w:r>
+      <w:r>
+        <w:t>[ICTCLD503 FS Reading] · [ICTCLD503 FS Self-management] · [ICTCLD503 FS Problem solving] — naturally evidenced through the Solution Design work and its troubleshooting; noted, not assessed separately.</w:t>
       </w:r>
     </w:p>
     <w:sectPr>

</xml_diff>